<commit_message>
docs: sync deployment results and database reference
Keep the account recovery integration test launcher portable across Windows and Linux.
</commit_message>
<xml_diff>
--- a/简单外卖功能介绍.docx
+++ b/简单外卖功能介绍.docx
@@ -33,7 +33,7 @@
     </w:p>
     <w:p>
       <w:r>
-        <w:t>技术栈为 HarmonyOS NEXT API 26、ArkTS 与 ArkUI，后端为 Spring Boot 3.5.16、Java 25、JdbcTemplate、MySQL 8.4 与 Redis 7。在线入口为 https://hqyx.website/takeout/。2026年10月25日安全复测及 defense-20261025-225329 属于历史基线，本轮发布结果以 README 和实施记录为准。</w:t>
+        <w:t>技术栈为 HarmonyOS NEXT API 26、ArkTS 与 ArkUI，后端为 Spring Boot 3.5.16、Java 25、JdbcTemplate、MySQL 8.4 与 Redis 7。入口为 https://hqyx.website/takeout/。当前版本 ux-20261026-1950-sync，运行源码 e6190a9，于 2026-10-26 19:57:59 +0800 核验；安全复测数据另列为历史基线。</w:t>
       </w:r>
     </w:p>
     <w:p>
@@ -2620,7 +2620,7 @@
                 <w:color w:val="000000"/>
                 <w:sz w:val="20"/>
               </w:rPr>
-              <w:t>网页使用 https://hqyx.website/takeout/ 及相对接口资源路径。新版本需保留现有独立密钥和持久卷、备份后执行新增字段迁移；实际标签与上线结果以本轮发布核验为准。</w:t>
+              <w:t>ux-20261026-1950-sync 已核验 HTTPS、4 份静态哈希及应用、网关、MySQL、Redis 健康；新增表、12 列和唯一索引到位。用户 51、订单 3、地址 3、商品 7200、门店 540 前后不变；数据库备份已下载校验，私有密钥与卷保留。</w:t>
             </w:r>
           </w:p>
         </w:tc>
@@ -2679,7 +2679,7 @@
                 <w:color w:val="000000"/>
                 <w:sz w:val="20"/>
               </w:rPr>
-              <w:t>优惠仅预估；未知提交的冻结请求保留于当前页面或浏览器会话，进程清理后需查真实订单。正式外部支付、完整售后、真机无障碍与 Release 上架仍需专项验收。</w:t>
+              <w:t>本次线上仅使用管理员完成 5 项认证或只读 API 检查，未执行四端交易；四端业务证据来自本地。未签名 debug HAP 只存服务器版本产物目录。正式支付、完整售后、真机无障碍与 Release 上架仍待验收。</w:t>
             </w:r>
           </w:p>
         </w:tc>
@@ -2714,7 +2714,7 @@
     </w:p>
     <w:p>
       <w:r>
-        <w:t>六批实际改动与逐批证据见 md/人性化改造诊断与实施方案.md；部署与最新验证状态见 README.md。2026年10月25日安全基线及保留风险见 md/audit/最终结论.md 与 round10/第十轮防御-回复.md。服务器源码和未签名 debug HAP 同步不等于 AppGallery 发布。</w:t>
+        <w:t>六批实际改动与逐批证据见 md/人性化改造诊断与实施方案.md；最新发布核验见 README.md。2026年10月25日安全基线及保留风险见 md/audit/最终结论.md 与 round10/第十轮防御-回复.md。服务器源码和未签名 debug HAP 同步不等于 AppGallery 发布。</w:t>
       </w:r>
     </w:p>
     <w:sectPr>

</xml_diff>

<commit_message>
docs: finalize synchronized release and verified database state
</commit_message>
<xml_diff>
--- a/简单外卖功能介绍.docx
+++ b/简单外卖功能介绍.docx
@@ -33,7 +33,7 @@
     </w:p>
     <w:p>
       <w:r>
-        <w:t>技术栈为 HarmonyOS NEXT API 26、ArkTS 与 ArkUI，后端为 Spring Boot 3.5.16、Java 25、JdbcTemplate、MySQL 8.4 与 Redis 7。入口为 https://hqyx.website/takeout/。当前版本 ux-20261026-1950-sync，运行源码 e6190a9，于 2026-10-26 19:57:59 +0800 核验；安全复测数据另列为历史基线。</w:t>
+        <w:t>技术栈为 HarmonyOS NEXT API 26、ArkTS 与 ArkUI，后端为 Spring Boot 3.5.16、Java 25、JdbcTemplate、MySQL 8.4 与 Redis 7。入口为 https://hqyx.website/takeout/。当前版本 ux-20261026-1950-sync-r2，运行源码 fc37a14，于 2026-10-26 20:30:14 +0800 核验；安全复测数据另列为历史基线。</w:t>
       </w:r>
     </w:p>
     <w:p>
@@ -2443,7 +2443,7 @@
                 <w:color w:val="000000"/>
                 <w:sz w:val="20"/>
               </w:rPr>
-              <w:t>第五批完整 reactor：app 641 项，其中 61 项环境条件跳过；gateway 9 项，无失败。退款另有 8 项独立真实 MySQL 通过。第六批金额规则 69 项通过。数量对应各批，不合并或把跳过算作已执行。</w:t>
+              <w:t>最终独立 Linux 全量 656 项通过，0 失败、0 错误、0 跳过。Windows app 647 项（61 项环境条件跳过）、gateway 9 项，无失败。两类运行结果分别报告，跳过不算已执行。</w:t>
             </w:r>
           </w:p>
         </w:tc>
@@ -2502,7 +2502,7 @@
                 <w:color w:val="000000"/>
                 <w:sz w:val="20"/>
               </w:rPr>
-              <w:t>发版前四套 Node 回归 76 项通过、三份 JS 语法检查通过，debug HAP 构建成功且正式域名优先。退款申请到拒绝、再申请、退款及骑手取餐到送达已在本地模拟器验证；不代表物理真机全覆盖。</w:t>
+              <w:t>四套 Node 回归 76 项、JS 语法检查通过，正式域名优先的 debug HAP 构建成功。本地模拟器已验证退款和骑手链路；GitHub Backend CI 已通过，Frontend 尚在排队，不代表物理真机全覆盖。</w:t>
             </w:r>
           </w:p>
         </w:tc>
@@ -2620,7 +2620,7 @@
                 <w:color w:val="000000"/>
                 <w:sz w:val="20"/>
               </w:rPr>
-              <w:t>ux-20261026-1950-sync 已核验 HTTPS、4 份静态哈希及应用、网关、MySQL、Redis 健康；新增表、12 列和唯一索引到位。用户 51、订单 3、地址 3、商品 7200、门店 540 前后不变；数据库备份已下载校验，私有密钥与卷保留。</w:t>
+              <w:t>ux-20261026-1950-sync-r2 已核验 HTTPS、静态资源及应用、网关、MySQL、Redis 健康。新表、12 列和唯一索引保留；用户 51、订单 3、地址 3、商品 7200、门店 540 不变；200386 字节备份已下载并校验，私有密钥与卷保留。</w:t>
             </w:r>
           </w:p>
         </w:tc>

</xml_diff>

<commit_message>
docs: record verified Windows runner and frontend CI success
</commit_message>
<xml_diff>
--- a/简单外卖功能介绍.docx
+++ b/简单外卖功能介绍.docx
@@ -2502,7 +2502,7 @@
                 <w:color w:val="000000"/>
                 <w:sz w:val="20"/>
               </w:rPr>
-              <w:t>四套 Node 回归 76 项、JS 语法检查通过，正式域名优先的 debug HAP 构建成功。本地模拟器已验证退款和骑手链路；GitHub Backend CI 已通过，Frontend 尚在排队，不代表物理真机全覆盖。</w:t>
+              <w:t>15 个 Node 脚本检查通过，Windows 自托管 runner 完成独立检出、依赖安装和 debug HAP 构建并上传产物。GitHub 前后端 CI 均通过；模拟器已验证退款和骑手链路，仍非物理真机全覆盖。</w:t>
             </w:r>
           </w:p>
         </w:tc>
@@ -2679,7 +2679,7 @@
                 <w:color w:val="000000"/>
                 <w:sz w:val="20"/>
               </w:rPr>
-              <w:t>本次线上仅使用管理员完成 5 项认证或只读 API 检查，未执行四端交易；四端业务证据来自本地。未签名 debug HAP 只存服务器版本产物目录。正式支付、完整售后、真机无障碍与 Release 上架仍待验收。</w:t>
+              <w:t>本次线上仅使用管理员完成 5 项认证或只读 API 检查，未执行四端交易；四端业务证据来自本地。未签名 debug HAP 保留于服务器及 GitHub CI 产物。正式支付、完整售后、真机无障碍与 Release 上架仍待验收。</w:t>
             </w:r>
           </w:p>
         </w:tc>

</xml_diff>